<commit_message>
docs: add README with demo guide and final test report
</commit_message>
<xml_diff>
--- a/docs/Test_Report.docx
+++ b/docs/Test_Report.docx
@@ -853,7 +853,7 @@
                 <w:sz w:val="19"/>
                 <w:szCs w:val="19"/>
               </w:rPr>
-              <w:t xml:space="preserve">Linux-6.18.44-fc-v153-x86_64-with-glibc2.39</w:t>
+              <w:t xml:space="preserve">Linux (GitHub Codespaces)</w:t>
             </w:r>
           </w:p>
         </w:tc>
@@ -923,7 +923,7 @@
                 <w:sz w:val="19"/>
                 <w:szCs w:val="19"/>
               </w:rPr>
-              <w:t xml:space="preserve">Python 3.12.3</w:t>
+              <w:t xml:space="preserve">Python 3.14.2</w:t>
             </w:r>
           </w:p>
         </w:tc>

</xml_diff>